<commit_message>
Add new chart image for CA1 in the project
</commit_message>
<xml_diff>
--- a/IXD803/Mine/Outdoor Activities/OutdoorActivity1/Primary Research-1 31-08-2026.docx
+++ b/IXD803/Mine/Outdoor Activities/OutdoorActivity1/Primary Research-1 31-08-2026.docx
@@ -1360,10 +1360,128 @@
     <w:p>
       <w:pPr>
         <w:pStyle w:val="ListParagraph"/>
+        <w:rPr>
+          <w:rFonts w:ascii="Calibri" w:hAnsi="Calibri" w:cs="Calibri"/>
+          <w:b/>
+          <w:bCs/>
+          <w:sz w:val="28"/>
+          <w:szCs w:val="28"/>
+          <w:u w:val="single"/>
+        </w:rPr>
+      </w:pPr>
+    </w:p>
+    <w:p>
+      <w:pPr>
+        <w:pStyle w:val="ListParagraph"/>
+        <w:rPr>
+          <w:rFonts w:ascii="Calibri" w:hAnsi="Calibri" w:cs="Calibri"/>
+          <w:b/>
+          <w:bCs/>
+          <w:sz w:val="28"/>
+          <w:szCs w:val="28"/>
+          <w:u w:val="single"/>
+        </w:rPr>
+      </w:pPr>
+    </w:p>
+    <w:p>
+      <w:pPr>
+        <w:pStyle w:val="ListParagraph"/>
+        <w:rPr>
+          <w:rFonts w:ascii="Calibri" w:hAnsi="Calibri" w:cs="Calibri"/>
+          <w:b/>
+          <w:bCs/>
+          <w:sz w:val="28"/>
+          <w:szCs w:val="28"/>
+          <w:u w:val="single"/>
+        </w:rPr>
+      </w:pPr>
+    </w:p>
+    <w:p>
+      <w:pPr>
+        <w:pStyle w:val="ListParagraph"/>
+        <w:rPr>
+          <w:rFonts w:ascii="Calibri" w:hAnsi="Calibri" w:cs="Calibri"/>
+          <w:b/>
+          <w:bCs/>
+          <w:sz w:val="28"/>
+          <w:szCs w:val="28"/>
+          <w:u w:val="single"/>
+        </w:rPr>
+      </w:pPr>
+    </w:p>
+    <w:p>
+      <w:pPr>
+        <w:pStyle w:val="ListParagraph"/>
+        <w:rPr>
+          <w:rFonts w:ascii="Calibri" w:hAnsi="Calibri" w:cs="Calibri"/>
+          <w:b/>
+          <w:bCs/>
+          <w:sz w:val="28"/>
+          <w:szCs w:val="28"/>
+          <w:u w:val="single"/>
+        </w:rPr>
+      </w:pPr>
+    </w:p>
+    <w:p>
+      <w:pPr>
+        <w:pStyle w:val="ListParagraph"/>
+        <w:rPr>
+          <w:rFonts w:ascii="Calibri" w:hAnsi="Calibri" w:cs="Calibri"/>
+          <w:b/>
+          <w:bCs/>
+          <w:sz w:val="28"/>
+          <w:szCs w:val="28"/>
+          <w:u w:val="single"/>
+        </w:rPr>
+      </w:pPr>
+    </w:p>
+    <w:p>
+      <w:pPr>
+        <w:pStyle w:val="ListParagraph"/>
+        <w:rPr>
+          <w:rFonts w:ascii="Calibri" w:hAnsi="Calibri" w:cs="Calibri"/>
+          <w:b/>
+          <w:bCs/>
+          <w:sz w:val="28"/>
+          <w:szCs w:val="28"/>
+          <w:u w:val="single"/>
+        </w:rPr>
+      </w:pPr>
+    </w:p>
+    <w:p>
+      <w:pPr>
+        <w:pStyle w:val="ListParagraph"/>
+        <w:rPr>
+          <w:rFonts w:ascii="Calibri" w:hAnsi="Calibri" w:cs="Calibri"/>
+          <w:b/>
+          <w:bCs/>
+          <w:sz w:val="28"/>
+          <w:szCs w:val="28"/>
+          <w:u w:val="single"/>
+        </w:rPr>
+      </w:pPr>
+    </w:p>
+    <w:p>
+      <w:pPr>
+        <w:pStyle w:val="ListParagraph"/>
+        <w:rPr>
+          <w:rFonts w:ascii="Calibri" w:hAnsi="Calibri" w:cs="Calibri"/>
+          <w:b/>
+          <w:bCs/>
+          <w:sz w:val="28"/>
+          <w:szCs w:val="28"/>
+          <w:u w:val="single"/>
+        </w:rPr>
+      </w:pPr>
+    </w:p>
+    <w:p>
+      <w:pPr>
+        <w:pStyle w:val="ListParagraph"/>
         <w:numPr>
           <w:ilvl w:val="0"/>
           <w:numId w:val="1"/>
         </w:numPr>
+        <w:spacing w:after="0"/>
         <w:rPr>
           <w:rFonts w:ascii="Calibri" w:hAnsi="Calibri" w:cs="Calibri"/>
           <w:b/>
@@ -1400,6 +1518,7 @@
     <w:p>
       <w:pPr>
         <w:pStyle w:val="ListParagraph"/>
+        <w:spacing w:after="0"/>
         <w:ind w:left="360"/>
         <w:rPr>
           <w:rFonts w:ascii="Calibri" w:hAnsi="Calibri" w:cs="Calibri"/>
@@ -1410,6 +1529,24 @@
           <w:u w:val="single"/>
         </w:rPr>
       </w:pPr>
+    </w:p>
+    <w:p>
+      <w:pPr>
+        <w:pStyle w:val="ListParagraph"/>
+        <w:numPr>
+          <w:ilvl w:val="0"/>
+          <w:numId w:val="1"/>
+        </w:numPr>
+        <w:spacing w:after="0"/>
+        <w:rPr>
+          <w:rFonts w:ascii="Calibri" w:hAnsi="Calibri" w:cs="Calibri"/>
+          <w:b/>
+          <w:bCs/>
+          <w:sz w:val="28"/>
+          <w:szCs w:val="28"/>
+          <w:u w:val="single"/>
+        </w:rPr>
+      </w:pPr>
       <w:r>
         <w:rPr>
           <w:rFonts w:ascii="Calibri" w:hAnsi="Calibri" w:cs="Calibri"/>
@@ -1420,19 +1557,10 @@
           <w:szCs w:val="28"/>
           <w:u w:val="single"/>
         </w:rPr>
-        <w:lastRenderedPageBreak/>
         <w:drawing>
-          <wp:anchor distT="0" distB="0" distL="114300" distR="114300" simplePos="0" relativeHeight="251658240" behindDoc="0" locked="0" layoutInCell="1" allowOverlap="1" wp14:anchorId="4D26394A" wp14:editId="0584D16B">
-            <wp:simplePos x="0" y="0"/>
-            <wp:positionH relativeFrom="column">
-              <wp:posOffset>-147955</wp:posOffset>
-            </wp:positionH>
-            <wp:positionV relativeFrom="paragraph">
-              <wp:posOffset>765175</wp:posOffset>
-            </wp:positionV>
+          <wp:inline distT="0" distB="0" distL="0" distR="0" wp14:anchorId="4D26394A" wp14:editId="52FA0E0D">
             <wp:extent cx="4702805" cy="6270171"/>
             <wp:effectExtent l="0" t="0" r="3175" b="0"/>
-            <wp:wrapSquare wrapText="bothSides"/>
             <wp:docPr id="1107778541" name="Picture 4"/>
             <wp:cNvGraphicFramePr>
               <a:graphicFrameLocks xmlns:a="http://schemas.openxmlformats.org/drawingml/2006/main" noChangeAspect="1"/>
@@ -1468,7 +1596,7 @@
                 </pic:pic>
               </a:graphicData>
             </a:graphic>
-          </wp:anchor>
+          </wp:inline>
         </w:drawing>
       </w:r>
     </w:p>

</xml_diff>